<commit_message>
Justify CV paragraphs and remove embedded links
</commit_message>
<xml_diff>
--- a/portfolio/Zain_CV.docx
+++ b/portfolio/Zain_CV.docx
@@ -6,6 +6,7 @@
       <w:pPr>
         <w:keepNext/>
         <w:spacing w:after="100"/>
+        <w:jc w:val="left"/>
       </w:pPr>
       <w:r>
         <w:rPr>
@@ -20,6 +21,7 @@
       <w:pPr>
         <w:keepNext/>
         <w:spacing w:after="80"/>
+        <w:jc w:val="left"/>
       </w:pPr>
       <w:r>
         <w:rPr>
@@ -34,6 +36,7 @@
       <w:pPr>
         <w:keepNext w:val="0"/>
         <w:spacing w:after="0"/>
+        <w:jc w:val="left"/>
       </w:pPr>
       <w:r>
         <w:rPr>
@@ -47,6 +50,7 @@
     <w:p>
       <w:pPr>
         <w:pStyle w:val="Heading1"/>
+        <w:jc w:val="left"/>
         <w:pBdr>
           <w:bottom w:val="single" w:sz="4" w:space="3" w:color="CBD6DA"/>
         </w:pBdr>
@@ -59,6 +63,7 @@
       <w:pPr>
         <w:keepNext w:val="0"/>
         <w:spacing w:after="60"/>
+        <w:jc w:val="both"/>
       </w:pPr>
       <w:r>
         <w:rPr>
@@ -70,6 +75,7 @@
     <w:p>
       <w:pPr>
         <w:pStyle w:val="Heading1"/>
+        <w:jc w:val="left"/>
         <w:pBdr>
           <w:bottom w:val="single" w:sz="4" w:space="3" w:color="CBD6DA"/>
         </w:pBdr>
@@ -79,6 +85,9 @@
       </w:r>
     </w:p>
     <w:p>
+      <w:pPr>
+        <w:jc w:val="both"/>
+      </w:pPr>
       <w:r>
         <w:rPr>
           <w:b/>
@@ -90,6 +99,9 @@
       </w:r>
     </w:p>
     <w:p>
+      <w:pPr>
+        <w:jc w:val="both"/>
+      </w:pPr>
       <w:r>
         <w:rPr>
           <w:b/>
@@ -101,6 +113,9 @@
       </w:r>
     </w:p>
     <w:p>
+      <w:pPr>
+        <w:jc w:val="both"/>
+      </w:pPr>
       <w:r>
         <w:rPr>
           <w:b/>
@@ -112,6 +127,9 @@
       </w:r>
     </w:p>
     <w:p>
+      <w:pPr>
+        <w:jc w:val="both"/>
+      </w:pPr>
       <w:r>
         <w:rPr>
           <w:b/>
@@ -123,6 +141,9 @@
       </w:r>
     </w:p>
     <w:p>
+      <w:pPr>
+        <w:jc w:val="both"/>
+      </w:pPr>
       <w:r>
         <w:rPr>
           <w:b/>
@@ -136,6 +157,7 @@
     <w:p>
       <w:pPr>
         <w:pStyle w:val="Heading1"/>
+        <w:jc w:val="left"/>
         <w:pBdr>
           <w:bottom w:val="single" w:sz="4" w:space="3" w:color="CBD6DA"/>
         </w:pBdr>
@@ -148,6 +170,7 @@
       <w:pPr>
         <w:keepNext/>
         <w:spacing w:after="40"/>
+        <w:jc w:val="left"/>
       </w:pPr>
       <w:r>
         <w:rPr>
@@ -162,6 +185,7 @@
       <w:pPr>
         <w:keepNext/>
         <w:spacing w:after="40"/>
+        <w:jc w:val="left"/>
       </w:pPr>
       <w:r>
         <w:rPr>
@@ -175,36 +199,8 @@
     <w:p>
       <w:pPr>
         <w:keepNext/>
-        <w:spacing w:after="60"/>
-      </w:pPr>
-      <w:hyperlink r:id="rId9">
-        <w:r>
-          <w:rPr>
-            <w:color w:val="183749"/>
-            <w:u w:val="single"/>
-            <w:sz w:val="18"/>
-          </w:rPr>
-          <w:t>GitHub source</w:t>
-        </w:r>
-      </w:hyperlink>
-      <w:r>
-        <w:t xml:space="preserve">  |  </w:t>
-      </w:r>
-      <w:hyperlink r:id="rId10">
-        <w:r>
-          <w:rPr>
-            <w:color w:val="183749"/>
-            <w:u w:val="single"/>
-            <w:sz w:val="18"/>
-          </w:rPr>
-          <w:t>Download offline HTML demo (ZIP)</w:t>
-        </w:r>
-      </w:hyperlink>
-    </w:p>
-    <w:p>
-      <w:pPr>
-        <w:keepNext/>
         <w:spacing w:after="100"/>
+        <w:jc w:val="both"/>
       </w:pPr>
       <w:r>
         <w:rPr>
@@ -223,6 +219,7 @@
     <w:p>
       <w:pPr>
         <w:pStyle w:val="ListBullet"/>
+        <w:jc w:val="both"/>
       </w:pPr>
       <w:r>
         <w:rPr>
@@ -237,6 +234,7 @@
     <w:p>
       <w:pPr>
         <w:pStyle w:val="ListBullet"/>
+        <w:jc w:val="both"/>
       </w:pPr>
       <w:r>
         <w:rPr>
@@ -251,6 +249,7 @@
     <w:p>
       <w:pPr>
         <w:pStyle w:val="ListBullet"/>
+        <w:jc w:val="both"/>
       </w:pPr>
       <w:r>
         <w:rPr>
@@ -265,6 +264,7 @@
     <w:p>
       <w:pPr>
         <w:pStyle w:val="ListBullet"/>
+        <w:jc w:val="both"/>
       </w:pPr>
       <w:r>
         <w:rPr>
@@ -279,6 +279,7 @@
     <w:p>
       <w:pPr>
         <w:pStyle w:val="ListBullet"/>
+        <w:jc w:val="both"/>
       </w:pPr>
       <w:r>
         <w:rPr>
@@ -293,6 +294,7 @@
     <w:p>
       <w:pPr>
         <w:pStyle w:val="ListBullet"/>
+        <w:jc w:val="both"/>
       </w:pPr>
       <w:r>
         <w:rPr>
@@ -307,6 +309,7 @@
     <w:p>
       <w:pPr>
         <w:pStyle w:val="ListBullet"/>
+        <w:jc w:val="both"/>
       </w:pPr>
       <w:r>
         <w:rPr>
@@ -321,6 +324,7 @@
     <w:p>
       <w:pPr>
         <w:pStyle w:val="ListBullet"/>
+        <w:jc w:val="both"/>
       </w:pPr>
       <w:r>
         <w:rPr>
@@ -335,6 +339,7 @@
     <w:p>
       <w:pPr>
         <w:pStyle w:val="Heading1"/>
+        <w:jc w:val="left"/>
         <w:pBdr>
           <w:bottom w:val="single" w:sz="4" w:space="3" w:color="CBD6DA"/>
         </w:pBdr>
@@ -347,6 +352,7 @@
       <w:pPr>
         <w:keepNext/>
         <w:spacing w:after="40"/>
+        <w:jc w:val="left"/>
       </w:pPr>
       <w:r>
         <w:rPr>
@@ -360,6 +366,7 @@
       <w:pPr>
         <w:keepNext w:val="0"/>
         <w:spacing w:after="60"/>
+        <w:jc w:val="left"/>
       </w:pPr>
       <w:r>
         <w:rPr>
@@ -373,6 +380,7 @@
       <w:pPr>
         <w:keepNext w:val="0"/>
         <w:spacing w:after="40"/>
+        <w:jc w:val="left"/>
       </w:pPr>
       <w:r>
         <w:rPr>
@@ -386,6 +394,7 @@
       <w:pPr>
         <w:keepNext w:val="0"/>
         <w:spacing w:after="40"/>
+        <w:jc w:val="left"/>
       </w:pPr>
       <w:r>
         <w:rPr>
@@ -398,6 +407,7 @@
     <w:p>
       <w:pPr>
         <w:pStyle w:val="Heading1"/>
+        <w:jc w:val="left"/>
         <w:pBdr>
           <w:bottom w:val="single" w:sz="4" w:space="3" w:color="CBD6DA"/>
         </w:pBdr>
@@ -410,6 +420,7 @@
       <w:pPr>
         <w:keepNext/>
         <w:spacing w:after="40"/>
+        <w:jc w:val="left"/>
       </w:pPr>
       <w:r>
         <w:rPr>
@@ -423,6 +434,7 @@
       <w:pPr>
         <w:keepNext w:val="0"/>
         <w:spacing w:after="0"/>
+        <w:jc w:val="left"/>
       </w:pPr>
       <w:r>
         <w:rPr>

</xml_diff>